<commit_message>
Update resume portfolio link
</commit_message>
<xml_diff>
--- a/assets/documents/Asir-Durai-Selvan-Senior-UI-UX-Designer-Resume.docx
+++ b/assets/documents/Asir-Durai-Selvan-Senior-UI-UX-Designer-Resume.docx
@@ -63,17 +63,7 @@
           <w:sz w:val="21"/>
           <w:szCs w:val="21"/>
         </w:rPr>
-        <w:t>Chennai, Tamil Nadu | Phone: +91 9600630414 | Email: asir.d.selvan@g</w:t>
-      </w:r>
-      <w:bookmarkStart w:id="0" w:name="_GoBack"/>
-      <w:bookmarkEnd w:id="0"/>
-      <w:r>
-        <w:rPr>
-          <w:rFonts w:ascii="Aptos" w:hAnsi="Aptos"/>
-          <w:sz w:val="21"/>
-          <w:szCs w:val="21"/>
-        </w:rPr>
-        <w:t>mail.com</w:t>
+        <w:t>Chennai, Tamil Nadu | Phone: +91 9600630414 | Email: asir.d.selvan@gmail.com</w:t>
       </w:r>
     </w:p>
     <w:p>
@@ -212,6 +202,8 @@
         </w:rPr>
         <w:t>PROFESSIONAL SUMMARY</w:t>
       </w:r>
+      <w:bookmarkStart w:id="0" w:name="_GoBack"/>
+      <w:bookmarkEnd w:id="0"/>
     </w:p>
     <w:p>
       <w:pPr>
@@ -13354,7 +13346,7 @@
 </file>
 
 <file path=customXml/itemProps1.xml><?xml version="1.0" encoding="utf-8"?>
-<ds:datastoreItem xmlns:ds="http://schemas.openxmlformats.org/officeDocument/2006/customXml" ds:itemID="{9FBF0835-9EC3-4DA9-A3C4-8E93A5A7BED9}">
+<ds:datastoreItem xmlns:ds="http://schemas.openxmlformats.org/officeDocument/2006/customXml" ds:itemID="{FD647046-9B3C-42BD-A2B5-E624B5DDD434}">
   <ds:schemaRefs>
     <ds:schemaRef ds:uri="http://schemas.openxmlformats.org/officeDocument/2006/bibliography"/>
   </ds:schemaRefs>

</xml_diff>